<commit_message>
Arquitectura 4+1 v1.1: el mapa y los KPI son solo del gerente
Co-Authored-By: Claude Sonnet 5.5 <noreply@anthropic.com>
</commit_message>
<xml_diff>
--- a/Fase 2/Evidencias Proyecto/Evidencias de documentación/Entrega 13-10-2026/07_Arquitectura_4mas1.docx
+++ b/Fase 2/Evidencias Proyecto/Evidencias de documentación/Entrega 13-10-2026/07_Arquitectura_4mas1.docx
@@ -318,7 +318,7 @@
               <w:rPr>
                 <w:sz w:val="19"/>
               </w:rPr>
-              <w:t>1.0 · 10-10-2026</w:t>
+              <w:t>1.1 · 12-10-2026</w:t>
             </w:r>
           </w:p>
         </w:tc>
@@ -451,7 +451,7 @@
           <w:color w:val="475569"/>
           <w:sz w:val="18"/>
         </w:rPr>
-        <w:t xml:space="preserve">Los diagramas describen el sistema tal como está publicado el 10-10-2026 (Vercel y Supabase), no un diseño futuro. Se generan desde el código con </w:t>
+        <w:t xml:space="preserve">Los diagramas describen el sistema tal como está publicado el 12-10-2026 (Vercel y Supabase), no un diseño futuro. Se generan desde el código con </w:t>
       </w:r>
       <w:r>
         <w:rPr>
@@ -1841,7 +1841,20 @@
         <w:rPr>
           <w:sz w:val="19"/>
         </w:rPr>
-        <w:t xml:space="preserve"> y además administra su CRM: usuarios, países, catálogo, presupuesto y límites.</w:t>
+        <w:t xml:space="preserve"> y además administra su CRM: usuarios, países, catálogo, presupuesto y límites. </w:t>
+      </w:r>
+      <w:r>
+        <w:rPr>
+          <w:b/>
+          <w:sz w:val="19"/>
+        </w:rPr>
+        <w:t>El mapa y los KPI son solo del gerente;</w:t>
+      </w:r>
+      <w:r>
+        <w:rPr>
+          <w:sz w:val="19"/>
+        </w:rPr>
+        <w:t xml:space="preserve"> el usuario base trabaja en Pipeline y Contacto.</w:t>
       </w:r>
     </w:p>
     <w:p>

</xml_diff>

<commit_message>
Arquitectura 4+1 con diagramas UML: clases, secuencia, estados, componentes, despliegue y casos de uso
Co-Authored-By: Claude Sonnet 5.5 <noreply@anthropic.com>
</commit_message>
<xml_diff>
--- a/Fase 2/Evidencias Proyecto/Evidencias de documentación/Entrega 13-10-2026/07_Arquitectura_4mas1.docx
+++ b/Fase 2/Evidencias Proyecto/Evidencias de documentación/Entrega 13-10-2026/07_Arquitectura_4mas1.docx
@@ -318,7 +318,7 @@
               <w:rPr>
                 <w:sz w:val="19"/>
               </w:rPr>
-              <w:t>1.1 · 12-10-2026</w:t>
+              <w:t>1.2 · 13-10-2026</w:t>
             </w:r>
           </w:p>
         </w:tc>
@@ -451,7 +451,7 @@
           <w:color w:val="475569"/>
           <w:sz w:val="18"/>
         </w:rPr>
-        <w:t xml:space="preserve">Los diagramas describen el sistema tal como está publicado el 12-10-2026 (Vercel y Supabase), no un diseño futuro. Se generan desde el código con </w:t>
+        <w:t xml:space="preserve">Los diagramas describen el sistema tal como está publicado el 13-10-2026 (Vercel y Supabase), no un diseño futuro. Usan notación UML 2 y se generan desde el repositorio con </w:t>
       </w:r>
       <w:r>
         <w:rPr>
@@ -459,7 +459,7 @@
           <w:color w:val="9D174D"/>
           <w:sz w:val="17"/>
         </w:rPr>
-        <w:t>npm run diagramas:4mas1</w:t>
+        <w:t>npm run diagramas:uml</w:t>
       </w:r>
       <w:r>
         <w:rPr>
@@ -699,7 +699,7 @@
               <w:rPr>
                 <w:sz w:val="18"/>
               </w:rPr>
-              <w:t>Modelo de datos (entidad-relación)</w:t>
+              <w:t>Diagrama de clases (UML)</w:t>
             </w:r>
           </w:p>
         </w:tc>
@@ -781,7 +781,7 @@
               <w:rPr>
                 <w:sz w:val="18"/>
               </w:rPr>
-              <w:t>Secuencia y proceso en segundo plano</w:t>
+              <w:t>Diagramas de secuencia y de estados (UML)</w:t>
             </w:r>
           </w:p>
         </w:tc>
@@ -859,7 +859,7 @@
               <w:rPr>
                 <w:sz w:val="18"/>
               </w:rPr>
-              <w:t>Capas y paquetes</w:t>
+              <w:t>Diagrama de componentes (UML)</w:t>
             </w:r>
           </w:p>
         </w:tc>
@@ -941,7 +941,7 @@
               <w:rPr>
                 <w:sz w:val="18"/>
               </w:rPr>
-              <w:t>Despliegue</w:t>
+              <w:t>Diagrama de despliegue (UML)</w:t>
             </w:r>
           </w:p>
         </w:tc>
@@ -1015,7 +1015,7 @@
               <w:rPr>
                 <w:sz w:val="18"/>
               </w:rPr>
-              <w:t>Casos de uso</w:t>
+              <w:t>Diagrama de casos de uso (UML)</w:t>
             </w:r>
           </w:p>
         </w:tc>
@@ -1182,7 +1182,7 @@
       <w:r>
         <w:drawing>
           <wp:inline xmlns:a="http://schemas.openxmlformats.org/drawingml/2006/main" xmlns:pic="http://schemas.openxmlformats.org/drawingml/2006/picture">
-            <wp:extent cx="8063999" cy="4900430"/>
+            <wp:extent cx="8063999" cy="3763200"/>
             <wp:docPr id="2" name="Picture 2"/>
             <wp:cNvGraphicFramePr>
               <a:graphicFrameLocks noChangeAspect="1"/>
@@ -1191,7 +1191,7 @@
               <a:graphicData uri="http://schemas.openxmlformats.org/drawingml/2006/picture">
                 <pic:pic>
                   <pic:nvPicPr>
-                    <pic:cNvPr id="0" name="4mas1-1-logica.png"/>
+                    <pic:cNvPr id="0" name="uml-1-clases.png"/>
                     <pic:cNvPicPr/>
                   </pic:nvPicPr>
                   <pic:blipFill>
@@ -1203,7 +1203,7 @@
                   <pic:spPr>
                     <a:xfrm>
                       <a:off x="0" y="0"/>
-                      <a:ext cx="8063999" cy="4900430"/>
+                      <a:ext cx="8063999" cy="3763200"/>
                     </a:xfrm>
                     <a:prstGeom prst="rect"/>
                   </pic:spPr>
@@ -1225,7 +1225,7 @@
           <w:color w:val="475569"/>
           <w:sz w:val="17"/>
         </w:rPr>
-        <w:t>Figura 1. Vista lógica: modelo de datos de Revela.</w:t>
+        <w:t>Figura 1. Diagrama de clases (UML): dominio de Revela, con el lead al centro.</w:t>
       </w:r>
     </w:p>
     <w:p>
@@ -1355,7 +1355,7 @@
       <w:r>
         <w:drawing>
           <wp:inline xmlns:a="http://schemas.openxmlformats.org/drawingml/2006/main" xmlns:pic="http://schemas.openxmlformats.org/drawingml/2006/picture">
-            <wp:extent cx="7416000" cy="4563692"/>
+            <wp:extent cx="7416000" cy="4054080"/>
             <wp:docPr id="3" name="Picture 3"/>
             <wp:cNvGraphicFramePr>
               <a:graphicFrameLocks noChangeAspect="1"/>
@@ -1364,7 +1364,7 @@
               <a:graphicData uri="http://schemas.openxmlformats.org/drawingml/2006/picture">
                 <pic:pic>
                   <pic:nvPicPr>
-                    <pic:cNvPr id="0" name="4mas1-2-procesos.png"/>
+                    <pic:cNvPr id="0" name="uml-2-secuencia.png"/>
                     <pic:cNvPicPr/>
                   </pic:nvPicPr>
                   <pic:blipFill>
@@ -1376,7 +1376,7 @@
                   <pic:spPr>
                     <a:xfrm>
                       <a:off x="0" y="0"/>
-                      <a:ext cx="7416000" cy="4563692"/>
+                      <a:ext cx="7416000" cy="4054080"/>
                     </a:xfrm>
                     <a:prstGeom prst="rect"/>
                   </pic:spPr>
@@ -1398,7 +1398,7 @@
           <w:color w:val="475569"/>
           <w:sz w:val="17"/>
         </w:rPr>
-        <w:t>Figura 2. Vista de procesos: secuencia del asistente de IA y suspensión automática de planes vencidos.</w:t>
+        <w:t>Figura 2. Diagrama de secuencia (UML): buscar empresas con el asistente y guardar un lead.</w:t>
       </w:r>
     </w:p>
     <w:p>
@@ -1470,12 +1470,12 @@
         <w:pStyle w:val="Heading1"/>
       </w:pPr>
       <w:r>
-        <w:t>5. Vista de desarrollo</w:t>
+        <w:t>4.1 Vista de procesos: ciclo de vida del lead</w:t>
       </w:r>
     </w:p>
     <w:p>
       <w:r>
-        <w:t>Responde a cómo está organizado el código y qué depende de qué: capas con dependencia hacia abajo, de la interfaz a la base de datos.</w:t>
+        <w:t>Muestra los estados por los que pasa un lead y qué lo saca del circuito: perderse desde cualquier etapa abierta o anonimizarse (un prospecto sin contacto en 30 días, o a pedido del titular).</w:t>
       </w:r>
     </w:p>
     <w:p>
@@ -1486,7 +1486,7 @@
       <w:r>
         <w:drawing>
           <wp:inline xmlns:a="http://schemas.openxmlformats.org/drawingml/2006/main" xmlns:pic="http://schemas.openxmlformats.org/drawingml/2006/picture">
-            <wp:extent cx="8063999" cy="4590276"/>
+            <wp:extent cx="8063999" cy="3440640"/>
             <wp:docPr id="4" name="Picture 4"/>
             <wp:cNvGraphicFramePr>
               <a:graphicFrameLocks noChangeAspect="1"/>
@@ -1495,7 +1495,7 @@
               <a:graphicData uri="http://schemas.openxmlformats.org/drawingml/2006/picture">
                 <pic:pic>
                   <pic:nvPicPr>
-                    <pic:cNvPr id="0" name="4mas1-3-desarrollo.png"/>
+                    <pic:cNvPr id="0" name="uml-6-estados.png"/>
                     <pic:cNvPicPr/>
                   </pic:nvPicPr>
                   <pic:blipFill>
@@ -1507,7 +1507,7 @@
                   <pic:spPr>
                     <a:xfrm>
                       <a:off x="0" y="0"/>
-                      <a:ext cx="8063999" cy="4590276"/>
+                      <a:ext cx="8063999" cy="3440640"/>
                     </a:xfrm>
                     <a:prstGeom prst="rect"/>
                   </pic:spPr>
@@ -1529,7 +1529,138 @@
           <w:color w:val="475569"/>
           <w:sz w:val="17"/>
         </w:rPr>
-        <w:t>Figura 3. Vista de desarrollo: capas y paquetes del repositorio.</w:t>
+        <w:t>Figura 3. Diagrama de estados (UML): ciclo de vida de un lead.</w:t>
+      </w:r>
+    </w:p>
+    <w:p>
+      <w:pPr>
+        <w:pStyle w:val="ListBullet"/>
+      </w:pPr>
+      <w:r>
+        <w:rPr>
+          <w:b/>
+          <w:sz w:val="19"/>
+        </w:rPr>
+        <w:t>Las etapas y sus probabilidades son configurables por CRM;</w:t>
+      </w:r>
+      <w:r>
+        <w:rPr>
+          <w:sz w:val="19"/>
+        </w:rPr>
+        <w:t xml:space="preserve"> las del dibujo son las de la cuenta demo.</w:t>
+      </w:r>
+    </w:p>
+    <w:p>
+      <w:pPr>
+        <w:pStyle w:val="ListBullet"/>
+      </w:pPr>
+      <w:r>
+        <w:rPr>
+          <w:b/>
+          <w:sz w:val="19"/>
+        </w:rPr>
+        <w:t>Anonimizar borra los datos personales y conserva la operación:</w:t>
+      </w:r>
+      <w:r>
+        <w:rPr>
+          <w:sz w:val="19"/>
+        </w:rPr>
+        <w:t xml:space="preserve"> nunca se re-identifica desde la edición.</w:t>
+      </w:r>
+    </w:p>
+    <w:p>
+      <w:pPr>
+        <w:pStyle w:val="ListBullet"/>
+      </w:pPr>
+      <w:r>
+        <w:rPr>
+          <w:b/>
+          <w:sz w:val="19"/>
+        </w:rPr>
+        <w:t>Con una solicitud del titular pendiente el lead queda bloqueado</w:t>
+      </w:r>
+      <w:r>
+        <w:rPr>
+          <w:sz w:val="19"/>
+        </w:rPr>
+        <w:t xml:space="preserve"> en las reglas y en la base: solo el gerente la resuelve.</w:t>
+      </w:r>
+    </w:p>
+    <w:p>
+      <w:pPr>
+        <w:sectPr>
+          <w:pgSz w:w="15840" w:h="12240" w:orient="landscape"/>
+          <w:pgMar w:top="1077" w:right="907" w:bottom="850" w:left="907" w:header="510" w:footer="510" w:gutter="0"/>
+          <w:cols w:space="720"/>
+          <w:docGrid w:linePitch="360"/>
+        </w:sectPr>
+      </w:pPr>
+    </w:p>
+    <w:p>
+      <w:pPr>
+        <w:pStyle w:val="Heading1"/>
+      </w:pPr>
+      <w:r>
+        <w:t>5. Vista de desarrollo</w:t>
+      </w:r>
+    </w:p>
+    <w:p>
+      <w:r>
+        <w:t>Responde a cómo está organizado el código y qué depende de qué: capas con dependencia hacia abajo, de la interfaz a la base de datos.</w:t>
+      </w:r>
+    </w:p>
+    <w:p>
+      <w:pPr>
+        <w:spacing w:after="40"/>
+        <w:jc w:val="center"/>
+      </w:pPr>
+      <w:r>
+        <w:drawing>
+          <wp:inline xmlns:a="http://schemas.openxmlformats.org/drawingml/2006/main" xmlns:pic="http://schemas.openxmlformats.org/drawingml/2006/picture">
+            <wp:extent cx="8063999" cy="3763200"/>
+            <wp:docPr id="5" name="Picture 5"/>
+            <wp:cNvGraphicFramePr>
+              <a:graphicFrameLocks noChangeAspect="1"/>
+            </wp:cNvGraphicFramePr>
+            <a:graphic>
+              <a:graphicData uri="http://schemas.openxmlformats.org/drawingml/2006/picture">
+                <pic:pic>
+                  <pic:nvPicPr>
+                    <pic:cNvPr id="0" name="uml-3-componentes.png"/>
+                    <pic:cNvPicPr/>
+                  </pic:nvPicPr>
+                  <pic:blipFill>
+                    <a:blip r:embed="rId15"/>
+                    <a:stretch>
+                      <a:fillRect/>
+                    </a:stretch>
+                  </pic:blipFill>
+                  <pic:spPr>
+                    <a:xfrm>
+                      <a:off x="0" y="0"/>
+                      <a:ext cx="8063999" cy="3763200"/>
+                    </a:xfrm>
+                    <a:prstGeom prst="rect"/>
+                  </pic:spPr>
+                </pic:pic>
+              </a:graphicData>
+            </a:graphic>
+          </wp:inline>
+        </w:drawing>
+      </w:r>
+    </w:p>
+    <w:p>
+      <w:pPr>
+        <w:spacing w:after="80"/>
+        <w:jc w:val="center"/>
+      </w:pPr>
+      <w:r>
+        <w:rPr>
+          <w:i/>
+          <w:color w:val="475569"/>
+          <w:sz w:val="17"/>
+        </w:rPr>
+        <w:t>Figura 4. Diagrama de componentes (UML): subsistemas del repositorio y sus dependencias.</w:t>
       </w:r>
     </w:p>
     <w:p>
@@ -1631,8 +1762,8 @@
       <w:r>
         <w:drawing>
           <wp:inline xmlns:a="http://schemas.openxmlformats.org/drawingml/2006/main" xmlns:pic="http://schemas.openxmlformats.org/drawingml/2006/picture">
-            <wp:extent cx="8063999" cy="4900430"/>
-            <wp:docPr id="5" name="Picture 5"/>
+            <wp:extent cx="8063999" cy="4139519"/>
+            <wp:docPr id="6" name="Picture 6"/>
             <wp:cNvGraphicFramePr>
               <a:graphicFrameLocks noChangeAspect="1"/>
             </wp:cNvGraphicFramePr>
@@ -1640,11 +1771,11 @@
               <a:graphicData uri="http://schemas.openxmlformats.org/drawingml/2006/picture">
                 <pic:pic>
                   <pic:nvPicPr>
-                    <pic:cNvPr id="0" name="4mas1-4-fisica.png"/>
+                    <pic:cNvPr id="0" name="uml-4-despliegue.png"/>
                     <pic:cNvPicPr/>
                   </pic:nvPicPr>
                   <pic:blipFill>
-                    <a:blip r:embed="rId15"/>
+                    <a:blip r:embed="rId16"/>
                     <a:stretch>
                       <a:fillRect/>
                     </a:stretch>
@@ -1652,7 +1783,7 @@
                   <pic:spPr>
                     <a:xfrm>
                       <a:off x="0" y="0"/>
-                      <a:ext cx="8063999" cy="4900430"/>
+                      <a:ext cx="8063999" cy="4139519"/>
                     </a:xfrm>
                     <a:prstGeom prst="rect"/>
                   </pic:spPr>
@@ -1674,7 +1805,7 @@
           <w:color w:val="475569"/>
           <w:sz w:val="17"/>
         </w:rPr>
-        <w:t>Figura 4. Vista física: despliegue en Vercel y Supabase, con los servicios externos.</w:t>
+        <w:t>Figura 5. Diagrama de despliegue (UML): Vercel y Supabase, con los servicios externos.</w:t>
       </w:r>
     </w:p>
     <w:p>
@@ -1762,8 +1893,8 @@
       <w:r>
         <w:drawing>
           <wp:inline xmlns:a="http://schemas.openxmlformats.org/drawingml/2006/main" xmlns:pic="http://schemas.openxmlformats.org/drawingml/2006/picture">
-            <wp:extent cx="8063999" cy="4962461"/>
-            <wp:docPr id="6" name="Picture 6"/>
+            <wp:extent cx="8063999" cy="4247039"/>
+            <wp:docPr id="7" name="Picture 7"/>
             <wp:cNvGraphicFramePr>
               <a:graphicFrameLocks noChangeAspect="1"/>
             </wp:cNvGraphicFramePr>
@@ -1771,11 +1902,11 @@
               <a:graphicData uri="http://schemas.openxmlformats.org/drawingml/2006/picture">
                 <pic:pic>
                   <pic:nvPicPr>
-                    <pic:cNvPr id="0" name="4mas1-5-escenarios.png"/>
+                    <pic:cNvPr id="0" name="uml-5-casos-de-uso.png"/>
                     <pic:cNvPicPr/>
                   </pic:nvPicPr>
                   <pic:blipFill>
-                    <a:blip r:embed="rId16"/>
+                    <a:blip r:embed="rId17"/>
                     <a:stretch>
                       <a:fillRect/>
                     </a:stretch>
@@ -1783,7 +1914,7 @@
                   <pic:spPr>
                     <a:xfrm>
                       <a:off x="0" y="0"/>
-                      <a:ext cx="8063999" cy="4962461"/>
+                      <a:ext cx="8063999" cy="4247039"/>
                     </a:xfrm>
                     <a:prstGeom prst="rect"/>
                   </pic:spPr>
@@ -1805,7 +1936,7 @@
           <w:color w:val="475569"/>
           <w:sz w:val="17"/>
         </w:rPr>
-        <w:t>Figura 5. Escenarios: actores y casos de uso de Revela.</w:t>
+        <w:t>Figura 6. Diagrama de casos de uso (UML): actores y escenarios de Revela.</w:t>
       </w:r>
     </w:p>
     <w:p>
@@ -2141,7 +2272,7 @@
               <w:rPr>
                 <w:sz w:val="16"/>
               </w:rPr>
-              <w:t>Secuencia de 12 pasos (Figura 2)</w:t>
+              <w:t>Diagrama de secuencia (Figura 2)</w:t>
             </w:r>
           </w:p>
         </w:tc>
@@ -2691,7 +2822,7 @@
               <w:rPr>
                 <w:sz w:val="16"/>
               </w:rPr>
-              <w:t>Tarea nocturna con gracia hasta el lunes (Figura 2)</w:t>
+              <w:t>Tarea nocturna con gracia hasta el lunes (Figura 3, estados)</w:t>
             </w:r>
           </w:p>
         </w:tc>

</xml_diff>